<commit_message>
finish lab6 and the report
</commit_message>
<xml_diff>
--- a/report/int250-B1-05-L5-67130500002-kritsanaphong.docx
+++ b/report/int250-B1-05-L5-67130500002-kritsanaphong.docx
@@ -120,8 +120,18 @@
           <w:sz w:val="32"/>
           <w:szCs w:val="32"/>
         </w:rPr>
-        <w:t>Lab#5: Shortly Website</w:t>
+        <w:t xml:space="preserve">Lab#6: </w:t>
       </w:r>
+      <w:proofErr w:type="spellStart"/>
+      <w:r>
+        <w:rPr>
+          <w:rFonts w:ascii="TH SarabunPSK" w:hAnsi="TH SarabunPSK" w:cs="TH SarabunPSK"/>
+          <w:sz w:val="32"/>
+          <w:szCs w:val="32"/>
+        </w:rPr>
+        <w:t>LoopStudios</w:t>
+      </w:r>
+      <w:proofErr w:type="spellEnd"/>
     </w:p>
     <w:p>
       <w:pPr>
@@ -906,13 +916,23 @@
               </w:rPr>
               <w:t xml:space="preserve">ำหน้าเว็บ </w:t>
             </w:r>
-            <w:r>
-              <w:rPr>
-                <w:rFonts w:ascii="TH SarabunPSK" w:hAnsi="TH SarabunPSK" w:cs="TH SarabunPSK"/>
-                <w:sz w:val="28"/>
-                <w:szCs w:val="32"/>
-              </w:rPr>
-              <w:t xml:space="preserve">shorty </w:t>
+            <w:proofErr w:type="spellStart"/>
+            <w:r>
+              <w:rPr>
+                <w:rFonts w:ascii="TH SarabunPSK" w:hAnsi="TH SarabunPSK" w:cs="TH SarabunPSK"/>
+                <w:sz w:val="28"/>
+                <w:szCs w:val="32"/>
+              </w:rPr>
+              <w:t>loopstudios</w:t>
+            </w:r>
+            <w:proofErr w:type="spellEnd"/>
+            <w:r>
+              <w:rPr>
+                <w:rFonts w:ascii="TH SarabunPSK" w:hAnsi="TH SarabunPSK" w:cs="TH SarabunPSK"/>
+                <w:sz w:val="28"/>
+                <w:szCs w:val="32"/>
+              </w:rPr>
+              <w:t xml:space="preserve"> </w:t>
             </w:r>
             <w:r>
               <w:rPr>
@@ -1031,9 +1051,10 @@
           <w:p>
             <w:pPr>
               <w:rPr>
-                <w:rFonts w:ascii="TH SarabunPSK" w:hAnsi="TH SarabunPSK" w:cs="TH SarabunPSK"/>
-                <w:sz w:val="28"/>
-                <w:szCs w:val="32"/>
+                <w:rFonts w:ascii="TH SarabunPSK" w:hAnsi="TH SarabunPSK" w:cs="TH SarabunPSK" w:hint="cs"/>
+                <w:sz w:val="28"/>
+                <w:szCs w:val="32"/>
+                <w:cs/>
               </w:rPr>
             </w:pPr>
             <w:r>
@@ -1042,16 +1063,103 @@
                 <w:sz w:val="28"/>
                 <w:szCs w:val="32"/>
               </w:rPr>
-              <w:t>&lt;template&gt;</w:t>
+              <w:t xml:space="preserve">&lt;div class="flex flex-col gap-4 </w:t>
+            </w:r>
+            <w:proofErr w:type="spellStart"/>
+            <w:proofErr w:type="gramStart"/>
+            <w:r>
+              <w:rPr>
+                <w:rFonts w:ascii="TH SarabunPSK" w:hAnsi="TH SarabunPSK" w:cs="TH SarabunPSK"/>
+                <w:sz w:val="28"/>
+                <w:szCs w:val="32"/>
+              </w:rPr>
+              <w:t>md:flex</w:t>
+            </w:r>
+            <w:proofErr w:type="gramEnd"/>
+            <w:r>
+              <w:rPr>
+                <w:rFonts w:ascii="TH SarabunPSK" w:hAnsi="TH SarabunPSK" w:cs="TH SarabunPSK"/>
+                <w:sz w:val="28"/>
+                <w:szCs w:val="32"/>
+              </w:rPr>
+              <w:t>-row</w:t>
+            </w:r>
+            <w:proofErr w:type="spellEnd"/>
+            <w:r>
+              <w:rPr>
+                <w:rFonts w:ascii="TH SarabunPSK" w:hAnsi="TH SarabunPSK" w:cs="TH SarabunPSK"/>
+                <w:sz w:val="28"/>
+                <w:szCs w:val="32"/>
+              </w:rPr>
+              <w:t xml:space="preserve"> </w:t>
+            </w:r>
+            <w:proofErr w:type="gramStart"/>
+            <w:r>
+              <w:rPr>
+                <w:rFonts w:ascii="TH SarabunPSK" w:hAnsi="TH SarabunPSK" w:cs="TH SarabunPSK"/>
+                <w:sz w:val="28"/>
+                <w:szCs w:val="32"/>
+              </w:rPr>
+              <w:t>md:gap</w:t>
+            </w:r>
+            <w:proofErr w:type="gramEnd"/>
+            <w:r>
+              <w:rPr>
+                <w:rFonts w:ascii="TH SarabunPSK" w:hAnsi="TH SarabunPSK" w:cs="TH SarabunPSK"/>
+                <w:sz w:val="28"/>
+                <w:szCs w:val="32"/>
+              </w:rPr>
+              <w:t>-6"&gt;</w:t>
+            </w:r>
+            <w:r>
+              <w:rPr>
+                <w:rFonts w:ascii="TH SarabunPSK" w:hAnsi="TH SarabunPSK" w:cs="TH SarabunPSK"/>
+                <w:sz w:val="28"/>
+                <w:szCs w:val="32"/>
+              </w:rPr>
+              <w:t xml:space="preserve"> //</w:t>
+            </w:r>
+            <w:r>
+              <w:rPr>
+                <w:rFonts w:ascii="TH SarabunPSK" w:hAnsi="TH SarabunPSK" w:cs="TH SarabunPSK" w:hint="cs"/>
+                <w:sz w:val="28"/>
+                <w:szCs w:val="32"/>
+                <w:cs/>
+              </w:rPr>
+              <w:t xml:space="preserve">กำหนดให้เป็น </w:t>
+            </w:r>
+            <w:r>
+              <w:rPr>
+                <w:rFonts w:ascii="TH SarabunPSK" w:hAnsi="TH SarabunPSK" w:cs="TH SarabunPSK"/>
+                <w:sz w:val="28"/>
+                <w:szCs w:val="32"/>
+              </w:rPr>
+              <w:t xml:space="preserve">flex </w:t>
+            </w:r>
+            <w:r>
+              <w:rPr>
+                <w:rFonts w:ascii="TH SarabunPSK" w:hAnsi="TH SarabunPSK" w:cs="TH SarabunPSK" w:hint="cs"/>
+                <w:sz w:val="28"/>
+                <w:szCs w:val="32"/>
+                <w:cs/>
+              </w:rPr>
+              <w:t xml:space="preserve">เรียงเป็นแนวตั้ง และเปลี่ยนเป็นแนวนอนเมื่อขนาด </w:t>
+            </w:r>
+            <w:r>
+              <w:rPr>
+                <w:rFonts w:ascii="TH SarabunPSK" w:hAnsi="TH SarabunPSK" w:cs="TH SarabunPSK"/>
+                <w:sz w:val="28"/>
+                <w:szCs w:val="32"/>
+              </w:rPr>
+              <w:t>&gt;= tablet</w:t>
             </w:r>
           </w:p>
           <w:p>
             <w:pPr>
               <w:rPr>
-                <w:rFonts w:ascii="TH SarabunPSK" w:hAnsi="TH SarabunPSK" w:cs="TH SarabunPSK" w:hint="cs"/>
-                <w:sz w:val="28"/>
-                <w:szCs w:val="32"/>
-                <w:cs/>
+                <w:rFonts w:ascii="TH SarabunPSK" w:hAnsi="TH SarabunPSK" w:cs="TH SarabunPSK"/>
+                <w:sz w:val="28"/>
+                <w:szCs w:val="32"/>
               </w:rPr>
             </w:pPr>
             <w:r>
@@ -1060,7 +1168,7 @@
                 <w:sz w:val="28"/>
                 <w:szCs w:val="32"/>
               </w:rPr>
-              <w:t xml:space="preserve">    &lt;div class="</w:t>
+              <w:t xml:space="preserve">          &lt;div v-for="item in </w:t>
             </w:r>
             <w:proofErr w:type="spellStart"/>
             <w:r>
@@ -1069,25 +1177,7 @@
                 <w:sz w:val="28"/>
                 <w:szCs w:val="32"/>
               </w:rPr>
-              <w:t>bg</w:t>
-            </w:r>
-            <w:proofErr w:type="spellEnd"/>
-            <w:r>
-              <w:rPr>
-                <w:rFonts w:ascii="TH SarabunPSK" w:hAnsi="TH SarabunPSK" w:cs="TH SarabunPSK"/>
-                <w:sz w:val="28"/>
-                <w:szCs w:val="32"/>
-              </w:rPr>
-              <w:t>-[</w:t>
-            </w:r>
-            <w:proofErr w:type="spellStart"/>
-            <w:r>
-              <w:rPr>
-                <w:rFonts w:ascii="TH SarabunPSK" w:hAnsi="TH SarabunPSK" w:cs="TH SarabunPSK"/>
-                <w:sz w:val="28"/>
-                <w:szCs w:val="32"/>
-              </w:rPr>
-              <w:t>url</w:t>
+              <w:t>menuItems</w:t>
             </w:r>
             <w:proofErr w:type="spellEnd"/>
             <w:proofErr w:type="gramStart"/>
@@ -1097,7 +1187,7 @@
                 <w:sz w:val="28"/>
                 <w:szCs w:val="32"/>
               </w:rPr>
-              <w:t>('@</w:t>
+              <w:t>" :key</w:t>
             </w:r>
             <w:proofErr w:type="gramEnd"/>
             <w:r>
@@ -1106,7 +1196,41 @@
                 <w:sz w:val="28"/>
                 <w:szCs w:val="32"/>
               </w:rPr>
-              <w:t>/assets/</w:t>
+              <w:t>="item.name" class="group"&gt;</w:t>
+            </w:r>
+            <w:r>
+              <w:rPr>
+                <w:rFonts w:ascii="TH SarabunPSK" w:hAnsi="TH SarabunPSK" w:cs="TH SarabunPSK"/>
+                <w:sz w:val="28"/>
+                <w:szCs w:val="32"/>
+              </w:rPr>
+              <w:t xml:space="preserve"> //</w:t>
+            </w:r>
+            <w:r>
+              <w:rPr>
+                <w:rFonts w:ascii="TH SarabunPSK" w:hAnsi="TH SarabunPSK" w:cs="TH SarabunPSK" w:hint="cs"/>
+                <w:sz w:val="28"/>
+                <w:szCs w:val="32"/>
+                <w:cs/>
+              </w:rPr>
+              <w:t xml:space="preserve">สร้าง </w:t>
+            </w:r>
+            <w:r>
+              <w:rPr>
+                <w:rFonts w:ascii="TH SarabunPSK" w:hAnsi="TH SarabunPSK" w:cs="TH SarabunPSK"/>
+                <w:sz w:val="28"/>
+                <w:szCs w:val="32"/>
+              </w:rPr>
+              <w:t xml:space="preserve">element </w:t>
+            </w:r>
+            <w:r>
+              <w:rPr>
+                <w:rFonts w:ascii="TH SarabunPSK" w:hAnsi="TH SarabunPSK" w:cs="TH SarabunPSK" w:hint="cs"/>
+                <w:sz w:val="28"/>
+                <w:szCs w:val="32"/>
+                <w:cs/>
+              </w:rPr>
+              <w:t xml:space="preserve">ที่คล้ายกันโดยดึงเอาข้อมูลมาจากชุดข้อมูลชื่อ </w:t>
             </w:r>
             <w:proofErr w:type="spellStart"/>
             <w:r>
@@ -1115,123 +1239,16 @@
                 <w:sz w:val="28"/>
                 <w:szCs w:val="32"/>
               </w:rPr>
-              <w:t>bg</w:t>
+              <w:t>menuItems</w:t>
             </w:r>
             <w:proofErr w:type="spellEnd"/>
-            <w:r>
-              <w:rPr>
-                <w:rFonts w:ascii="TH SarabunPSK" w:hAnsi="TH SarabunPSK" w:cs="TH SarabunPSK"/>
-                <w:sz w:val="28"/>
-                <w:szCs w:val="32"/>
-              </w:rPr>
-              <w:t>-boost-</w:t>
-            </w:r>
-            <w:proofErr w:type="spellStart"/>
-            <w:r>
-              <w:rPr>
-                <w:rFonts w:ascii="TH SarabunPSK" w:hAnsi="TH SarabunPSK" w:cs="TH SarabunPSK"/>
-                <w:sz w:val="28"/>
-                <w:szCs w:val="32"/>
-              </w:rPr>
-              <w:t>mobile.svg</w:t>
-            </w:r>
-            <w:proofErr w:type="spellEnd"/>
-            <w:r>
-              <w:rPr>
-                <w:rFonts w:ascii="TH SarabunPSK" w:hAnsi="TH SarabunPSK" w:cs="TH SarabunPSK"/>
-                <w:sz w:val="28"/>
-                <w:szCs w:val="32"/>
-              </w:rPr>
-              <w:t xml:space="preserve">')] </w:t>
-            </w:r>
-            <w:proofErr w:type="spellStart"/>
-            <w:r>
-              <w:rPr>
-                <w:rFonts w:ascii="TH SarabunPSK" w:hAnsi="TH SarabunPSK" w:cs="TH SarabunPSK"/>
-                <w:sz w:val="28"/>
-                <w:szCs w:val="32"/>
-              </w:rPr>
-              <w:t>bg</w:t>
-            </w:r>
-            <w:proofErr w:type="spellEnd"/>
-            <w:r>
-              <w:rPr>
-                <w:rFonts w:ascii="TH SarabunPSK" w:hAnsi="TH SarabunPSK" w:cs="TH SarabunPSK"/>
-                <w:sz w:val="28"/>
-                <w:szCs w:val="32"/>
-              </w:rPr>
-              <w:t xml:space="preserve">-no-repeat </w:t>
-            </w:r>
-            <w:proofErr w:type="spellStart"/>
-            <w:r>
-              <w:rPr>
-                <w:rFonts w:ascii="TH SarabunPSK" w:hAnsi="TH SarabunPSK" w:cs="TH SarabunPSK"/>
-                <w:sz w:val="28"/>
-                <w:szCs w:val="32"/>
-              </w:rPr>
-              <w:t>bg</w:t>
-            </w:r>
-            <w:proofErr w:type="spellEnd"/>
-            <w:r>
-              <w:rPr>
-                <w:rFonts w:ascii="TH SarabunPSK" w:hAnsi="TH SarabunPSK" w:cs="TH SarabunPSK"/>
-                <w:sz w:val="28"/>
-                <w:szCs w:val="32"/>
-              </w:rPr>
-              <w:t>-</w:t>
-            </w:r>
-            <w:proofErr w:type="gramStart"/>
-            <w:r>
-              <w:rPr>
-                <w:rFonts w:ascii="TH SarabunPSK" w:hAnsi="TH SarabunPSK" w:cs="TH SarabunPSK"/>
-                <w:sz w:val="28"/>
-                <w:szCs w:val="32"/>
-              </w:rPr>
-              <w:t>cover flex</w:t>
-            </w:r>
-            <w:proofErr w:type="gramEnd"/>
-            <w:r>
-              <w:rPr>
-                <w:rFonts w:ascii="TH SarabunPSK" w:hAnsi="TH SarabunPSK" w:cs="TH SarabunPSK"/>
-                <w:sz w:val="28"/>
-                <w:szCs w:val="32"/>
-              </w:rPr>
-              <w:t xml:space="preserve"> flex-col items-center justify-center h-[50vh] bg-indigo-950"&gt;</w:t>
-            </w:r>
-            <w:r>
-              <w:rPr>
-                <w:rFonts w:ascii="TH SarabunPSK" w:hAnsi="TH SarabunPSK" w:cs="TH SarabunPSK" w:hint="cs"/>
-                <w:sz w:val="28"/>
-                <w:szCs w:val="32"/>
-                <w:cs/>
-              </w:rPr>
-              <w:t xml:space="preserve"> </w:t>
-            </w:r>
-            <w:r>
-              <w:rPr>
-                <w:rFonts w:ascii="TH SarabunPSK" w:hAnsi="TH SarabunPSK" w:cs="TH SarabunPSK"/>
-                <w:sz w:val="28"/>
-                <w:szCs w:val="32"/>
-              </w:rPr>
-              <w:t xml:space="preserve">// </w:t>
-            </w:r>
-            <w:r>
-              <w:rPr>
-                <w:rFonts w:ascii="TH SarabunPSK" w:hAnsi="TH SarabunPSK" w:cs="TH SarabunPSK" w:hint="cs"/>
-                <w:sz w:val="28"/>
-                <w:szCs w:val="32"/>
-                <w:cs/>
-              </w:rPr>
-              <w:t>ดึงรูปภาพพื้นหลังมาและปรับสีพื้นหลัง</w:t>
-            </w:r>
           </w:p>
           <w:p>
             <w:pPr>
               <w:rPr>
-                <w:rFonts w:ascii="TH SarabunPSK" w:hAnsi="TH SarabunPSK" w:cs="TH SarabunPSK" w:hint="cs"/>
-                <w:sz w:val="28"/>
-                <w:szCs w:val="32"/>
-                <w:cs/>
+                <w:rFonts w:ascii="TH SarabunPSK" w:hAnsi="TH SarabunPSK" w:cs="TH SarabunPSK"/>
+                <w:sz w:val="28"/>
+                <w:szCs w:val="32"/>
               </w:rPr>
             </w:pPr>
             <w:r>
@@ -1240,50 +1257,35 @@
                 <w:sz w:val="28"/>
                 <w:szCs w:val="32"/>
               </w:rPr>
-              <w:t xml:space="preserve">        &lt;p class="text-white text-6xl font-bold mb-6"&gt;</w:t>
-            </w:r>
-            <w:r>
-              <w:rPr>
-                <w:rFonts w:ascii="TH SarabunPSK" w:hAnsi="TH SarabunPSK" w:cs="TH SarabunPSK" w:hint="cs"/>
-                <w:sz w:val="28"/>
-                <w:szCs w:val="32"/>
-                <w:cs/>
-              </w:rPr>
-              <w:t xml:space="preserve"> </w:t>
-            </w:r>
-            <w:r>
-              <w:rPr>
-                <w:rFonts w:ascii="TH SarabunPSK" w:hAnsi="TH SarabunPSK" w:cs="TH SarabunPSK"/>
-                <w:sz w:val="28"/>
-                <w:szCs w:val="32"/>
-              </w:rPr>
-              <w:t xml:space="preserve">// </w:t>
-            </w:r>
-            <w:r>
-              <w:rPr>
-                <w:rFonts w:ascii="TH SarabunPSK" w:hAnsi="TH SarabunPSK" w:cs="TH SarabunPSK" w:hint="cs"/>
-                <w:sz w:val="28"/>
-                <w:szCs w:val="32"/>
-                <w:cs/>
-              </w:rPr>
-              <w:t xml:space="preserve">ทำให้ </w:t>
-            </w:r>
-            <w:r>
-              <w:rPr>
-                <w:rFonts w:ascii="TH SarabunPSK" w:hAnsi="TH SarabunPSK" w:cs="TH SarabunPSK"/>
-                <w:sz w:val="28"/>
-                <w:szCs w:val="32"/>
-              </w:rPr>
-              <w:t xml:space="preserve">font </w:t>
-            </w:r>
-            <w:r>
-              <w:rPr>
-                <w:rFonts w:ascii="TH SarabunPSK" w:hAnsi="TH SarabunPSK" w:cs="TH SarabunPSK" w:hint="cs"/>
-                <w:sz w:val="28"/>
-                <w:szCs w:val="32"/>
-                <w:cs/>
-              </w:rPr>
-              <w:t>เป็นตัวสีขาวและเป็นตัวหนา</w:t>
+              <w:t xml:space="preserve">            &lt;a </w:t>
+            </w:r>
+            <w:proofErr w:type="spellStart"/>
+            <w:r>
+              <w:rPr>
+                <w:rFonts w:ascii="TH SarabunPSK" w:hAnsi="TH SarabunPSK" w:cs="TH SarabunPSK"/>
+                <w:sz w:val="28"/>
+                <w:szCs w:val="32"/>
+              </w:rPr>
+              <w:t>href</w:t>
+            </w:r>
+            <w:proofErr w:type="spellEnd"/>
+            <w:proofErr w:type="gramStart"/>
+            <w:r>
+              <w:rPr>
+                <w:rFonts w:ascii="TH SarabunPSK" w:hAnsi="TH SarabunPSK" w:cs="TH SarabunPSK"/>
+                <w:sz w:val="28"/>
+                <w:szCs w:val="32"/>
+              </w:rPr>
+              <w:t>="#</w:t>
+            </w:r>
+            <w:proofErr w:type="gramEnd"/>
+            <w:r>
+              <w:rPr>
+                <w:rFonts w:ascii="TH SarabunPSK" w:hAnsi="TH SarabunPSK" w:cs="TH SarabunPSK"/>
+                <w:sz w:val="28"/>
+                <w:szCs w:val="32"/>
+              </w:rPr>
+              <w:t>" class="relative"&gt;</w:t>
             </w:r>
           </w:p>
           <w:p>
@@ -1300,7 +1302,25 @@
                 <w:sz w:val="28"/>
                 <w:szCs w:val="32"/>
               </w:rPr>
-              <w:t xml:space="preserve">            Boost your links today</w:t>
+              <w:t xml:space="preserve">              </w:t>
+            </w:r>
+            <w:proofErr w:type="gramStart"/>
+            <w:r>
+              <w:rPr>
+                <w:rFonts w:ascii="TH SarabunPSK" w:hAnsi="TH SarabunPSK" w:cs="TH SarabunPSK"/>
+                <w:sz w:val="28"/>
+                <w:szCs w:val="32"/>
+              </w:rPr>
+              <w:t>{{ item.name</w:t>
+            </w:r>
+            <w:proofErr w:type="gramEnd"/>
+            <w:r>
+              <w:rPr>
+                <w:rFonts w:ascii="TH SarabunPSK" w:hAnsi="TH SarabunPSK" w:cs="TH SarabunPSK"/>
+                <w:sz w:val="28"/>
+                <w:szCs w:val="32"/>
+              </w:rPr>
+              <w:t xml:space="preserve"> }}</w:t>
             </w:r>
           </w:p>
           <w:p>
@@ -1317,16 +1337,33 @@
                 <w:sz w:val="28"/>
                 <w:szCs w:val="32"/>
               </w:rPr>
-              <w:t xml:space="preserve">        &lt;/p&gt;</w:t>
+              <w:t xml:space="preserve">              </w:t>
+            </w:r>
+            <w:proofErr w:type="gramStart"/>
+            <w:r>
+              <w:rPr>
+                <w:rFonts w:ascii="TH SarabunPSK" w:hAnsi="TH SarabunPSK" w:cs="TH SarabunPSK"/>
+                <w:sz w:val="28"/>
+                <w:szCs w:val="32"/>
+              </w:rPr>
+              <w:t>&lt;!--</w:t>
+            </w:r>
+            <w:proofErr w:type="gramEnd"/>
+            <w:r>
+              <w:rPr>
+                <w:rFonts w:ascii="TH SarabunPSK" w:hAnsi="TH SarabunPSK" w:cs="TH SarabunPSK"/>
+                <w:sz w:val="28"/>
+                <w:szCs w:val="32"/>
+              </w:rPr>
+              <w:t xml:space="preserve"> hover underline --&gt;</w:t>
             </w:r>
           </w:p>
           <w:p>
             <w:pPr>
               <w:rPr>
-                <w:rFonts w:ascii="TH SarabunPSK" w:hAnsi="TH SarabunPSK" w:cs="TH SarabunPSK" w:hint="cs"/>
-                <w:sz w:val="28"/>
-                <w:szCs w:val="32"/>
-                <w:cs/>
+                <w:rFonts w:ascii="TH SarabunPSK" w:hAnsi="TH SarabunPSK" w:cs="TH SarabunPSK"/>
+                <w:sz w:val="28"/>
+                <w:szCs w:val="32"/>
               </w:rPr>
             </w:pPr>
             <w:r>
@@ -1335,11 +1372,19 @@
                 <w:sz w:val="28"/>
                 <w:szCs w:val="32"/>
               </w:rPr>
-              <w:t xml:space="preserve">        &lt;button class="px-10 py-5 bg-sky-500 text-white rounded-full text-3xl font-bold"&gt;</w:t>
-            </w:r>
-            <w:r>
-              <w:rPr>
-                <w:rFonts w:ascii="TH SarabunPSK" w:hAnsi="TH SarabunPSK" w:cs="TH SarabunPSK" w:hint="cs"/>
+              <w:t>              &lt;span class="block h-</w:t>
+            </w:r>
+            <w:r>
+              <w:rPr>
+                <w:rFonts w:ascii="TH SarabunPSK" w:hAnsi="TH SarabunPSK" w:cs="TH SarabunPSK"/>
+                <w:sz w:val="28"/>
+                <w:szCs w:val="32"/>
+              </w:rPr>
+              <w:t>0.5</w:t>
+            </w:r>
+            <w:r>
+              <w:rPr>
+                <w:rFonts w:ascii="TH SarabunPSK" w:hAnsi="TH SarabunPSK" w:cs="TH SarabunPSK"/>
                 <w:sz w:val="28"/>
                 <w:szCs w:val="32"/>
                 <w:cs/>
@@ -1352,16 +1397,61 @@
                 <w:sz w:val="28"/>
                 <w:szCs w:val="32"/>
               </w:rPr>
-              <w:t xml:space="preserve">// </w:t>
-            </w:r>
-            <w:r>
-              <w:rPr>
-                <w:rFonts w:ascii="TH SarabunPSK" w:hAnsi="TH SarabunPSK" w:cs="TH SarabunPSK" w:hint="cs"/>
-                <w:sz w:val="28"/>
-                <w:szCs w:val="32"/>
-                <w:cs/>
-              </w:rPr>
-              <w:t>ปรับสีปุ่มและทำให้ปุ่มมีความยาวขึ้นนิดหน่อยเพื่อความสมดุล</w:t>
+              <w:t xml:space="preserve">w-0 </w:t>
+            </w:r>
+            <w:proofErr w:type="spellStart"/>
+            <w:r>
+              <w:rPr>
+                <w:rFonts w:ascii="TH SarabunPSK" w:hAnsi="TH SarabunPSK" w:cs="TH SarabunPSK"/>
+                <w:sz w:val="28"/>
+                <w:szCs w:val="32"/>
+              </w:rPr>
+              <w:t>bg</w:t>
+            </w:r>
+            <w:proofErr w:type="spellEnd"/>
+            <w:r>
+              <w:rPr>
+                <w:rFonts w:ascii="TH SarabunPSK" w:hAnsi="TH SarabunPSK" w:cs="TH SarabunPSK"/>
+                <w:sz w:val="28"/>
+                <w:szCs w:val="32"/>
+              </w:rPr>
+              <w:t xml:space="preserve">-white transition-all duration-300 </w:t>
+            </w:r>
+            <w:proofErr w:type="spellStart"/>
+            <w:r>
+              <w:rPr>
+                <w:rFonts w:ascii="TH SarabunPSK" w:hAnsi="TH SarabunPSK" w:cs="TH SarabunPSK"/>
+                <w:sz w:val="28"/>
+                <w:szCs w:val="32"/>
+              </w:rPr>
+              <w:t>group-</w:t>
+            </w:r>
+            <w:proofErr w:type="gramStart"/>
+            <w:r>
+              <w:rPr>
+                <w:rFonts w:ascii="TH SarabunPSK" w:hAnsi="TH SarabunPSK" w:cs="TH SarabunPSK"/>
+                <w:sz w:val="28"/>
+                <w:szCs w:val="32"/>
+              </w:rPr>
+              <w:t>hover:w</w:t>
+            </w:r>
+            <w:proofErr w:type="gramEnd"/>
+            <w:r>
+              <w:rPr>
+                <w:rFonts w:ascii="TH SarabunPSK" w:hAnsi="TH SarabunPSK" w:cs="TH SarabunPSK"/>
+                <w:sz w:val="28"/>
+                <w:szCs w:val="32"/>
+              </w:rPr>
+              <w:t>-full</w:t>
+            </w:r>
+            <w:proofErr w:type="spellEnd"/>
+            <w:r>
+              <w:rPr>
+                <w:rFonts w:ascii="TH SarabunPSK" w:hAnsi="TH SarabunPSK" w:cs="TH SarabunPSK"/>
+                <w:sz w:val="28"/>
+                <w:szCs w:val="32"/>
+              </w:rPr>
+              <w:t>"&gt;&lt;/span&gt;</w:t>
             </w:r>
           </w:p>
           <w:p>
@@ -1378,7 +1468,7 @@
                 <w:sz w:val="28"/>
                 <w:szCs w:val="32"/>
               </w:rPr>
-              <w:t xml:space="preserve">            Get Started</w:t>
+              <w:t>            &lt;/a&gt;</w:t>
             </w:r>
           </w:p>
           <w:p>
@@ -1395,7 +1485,7 @@
                 <w:sz w:val="28"/>
                 <w:szCs w:val="32"/>
               </w:rPr>
-              <w:t xml:space="preserve">        &lt;/button&gt;</w:t>
+              <w:t>          &lt;/div&gt;</w:t>
             </w:r>
           </w:p>
           <w:p>
@@ -1412,7 +1502,7 @@
                 <w:sz w:val="28"/>
                 <w:szCs w:val="32"/>
               </w:rPr>
-              <w:t xml:space="preserve">    &lt;/div&gt;</w:t>
+              <w:t>        &lt;/div&gt;</w:t>
             </w:r>
           </w:p>
           <w:p>
@@ -1424,14 +1514,6 @@
                 <w:cs/>
               </w:rPr>
             </w:pPr>
-            <w:r>
-              <w:rPr>
-                <w:rFonts w:ascii="TH SarabunPSK" w:hAnsi="TH SarabunPSK" w:cs="TH SarabunPSK"/>
-                <w:sz w:val="28"/>
-                <w:szCs w:val="32"/>
-              </w:rPr>
-              <w:t>&lt;/template&gt;</w:t>
-            </w:r>
           </w:p>
         </w:tc>
       </w:tr>
@@ -1577,7 +1659,6 @@
                 <w:rFonts w:ascii="TH SarabunPSK" w:hAnsi="TH SarabunPSK" w:cs="TH SarabunPSK"/>
                 <w:sz w:val="32"/>
                 <w:szCs w:val="32"/>
-                <w:cs/>
               </w:rPr>
             </w:pPr>
             <w:r>
@@ -1588,16 +1669,7 @@
                 <w:szCs w:val="32"/>
                 <w:cs/>
               </w:rPr>
-              <w:t xml:space="preserve">มีบางจังหวะที่จำวิธีการเขียนหรือ </w:t>
-            </w:r>
-            <w:r>
-              <w:rPr>
-                <w:rFonts w:ascii="TH SarabunPSK" w:hAnsi="TH SarabunPSK" w:cs="TH SarabunPSK"/>
-                <w:color w:val="7F7F7F" w:themeColor="text1" w:themeTint="80"/>
-                <w:sz w:val="32"/>
-                <w:szCs w:val="32"/>
-              </w:rPr>
-              <w:t xml:space="preserve">syntax </w:t>
+              <w:t>มีบาง</w:t>
             </w:r>
             <w:r>
               <w:rPr>
@@ -1607,7 +1679,16 @@
                 <w:szCs w:val="32"/>
                 <w:cs/>
               </w:rPr>
-              <w:t>ไม่ได้</w:t>
+              <w:t xml:space="preserve">กับการใช้ </w:t>
+            </w:r>
+            <w:r>
+              <w:rPr>
+                <w:rFonts w:ascii="TH SarabunPSK" w:hAnsi="TH SarabunPSK" w:cs="TH SarabunPSK"/>
+                <w:color w:val="7F7F7F" w:themeColor="text1" w:themeTint="80"/>
+                <w:sz w:val="32"/>
+                <w:szCs w:val="32"/>
+              </w:rPr>
+              <w:t xml:space="preserve">ref </w:t>
             </w:r>
             <w:r>
               <w:rPr>
@@ -1617,7 +1698,16 @@
                 <w:szCs w:val="32"/>
                 <w:cs/>
               </w:rPr>
-              <w:t xml:space="preserve"> หรือไม่รู้ว่าต้องจัดหน้าเว็บแบบไหน</w:t>
+              <w:t xml:space="preserve">และการทำ </w:t>
+            </w:r>
+            <w:r>
+              <w:rPr>
+                <w:rFonts w:ascii="TH SarabunPSK" w:hAnsi="TH SarabunPSK" w:cs="TH SarabunPSK"/>
+                <w:color w:val="7F7F7F" w:themeColor="text1" w:themeTint="80"/>
+                <w:sz w:val="32"/>
+                <w:szCs w:val="32"/>
+              </w:rPr>
+              <w:t xml:space="preserve">hamburger button </w:t>
             </w:r>
             <w:r>
               <w:rPr>
@@ -1627,7 +1717,16 @@
                 <w:szCs w:val="32"/>
                 <w:cs/>
               </w:rPr>
-              <w:t xml:space="preserve"> </w:t>
+              <w:t xml:space="preserve">เพราะยังไม่เข้าใจโครงสร้างและ </w:t>
+            </w:r>
+            <w:r>
+              <w:rPr>
+                <w:rFonts w:ascii="TH SarabunPSK" w:hAnsi="TH SarabunPSK" w:cs="TH SarabunPSK"/>
+                <w:color w:val="7F7F7F" w:themeColor="text1" w:themeTint="80"/>
+                <w:sz w:val="32"/>
+                <w:szCs w:val="32"/>
+              </w:rPr>
+              <w:t xml:space="preserve">flow </w:t>
             </w:r>
             <w:r>
               <w:rPr>
@@ -1637,8 +1736,39 @@
                 <w:szCs w:val="32"/>
                 <w:cs/>
               </w:rPr>
-              <w:t>จึง</w:t>
-            </w:r>
+              <w:t xml:space="preserve">ในการทำงานของ </w:t>
+            </w:r>
+            <w:proofErr w:type="spellStart"/>
+            <w:r>
+              <w:rPr>
+                <w:rFonts w:ascii="TH SarabunPSK" w:hAnsi="TH SarabunPSK" w:cs="TH SarabunPSK"/>
+                <w:color w:val="7F7F7F" w:themeColor="text1" w:themeTint="80"/>
+                <w:sz w:val="32"/>
+                <w:szCs w:val="32"/>
+              </w:rPr>
+              <w:t>vue</w:t>
+            </w:r>
+            <w:proofErr w:type="spellEnd"/>
+            <w:r>
+              <w:rPr>
+                <w:rFonts w:ascii="TH SarabunPSK" w:hAnsi="TH SarabunPSK" w:cs="TH SarabunPSK"/>
+                <w:color w:val="7F7F7F" w:themeColor="text1" w:themeTint="80"/>
+                <w:sz w:val="32"/>
+                <w:szCs w:val="32"/>
+              </w:rPr>
+              <w:t xml:space="preserve">, </w:t>
+            </w:r>
+            <w:proofErr w:type="spellStart"/>
+            <w:r>
+              <w:rPr>
+                <w:rFonts w:ascii="TH SarabunPSK" w:hAnsi="TH SarabunPSK" w:cs="TH SarabunPSK"/>
+                <w:color w:val="7F7F7F" w:themeColor="text1" w:themeTint="80"/>
+                <w:sz w:val="32"/>
+                <w:szCs w:val="32"/>
+              </w:rPr>
+              <w:t>js</w:t>
+            </w:r>
+            <w:proofErr w:type="spellEnd"/>
             <w:r>
               <w:rPr>
                 <w:rFonts w:ascii="TH SarabunPSK" w:hAnsi="TH SarabunPSK" w:cs="TH SarabunPSK" w:hint="cs"/>
@@ -1647,7 +1777,7 @@
                 <w:szCs w:val="32"/>
                 <w:cs/>
               </w:rPr>
-              <w:t xml:space="preserve">ได้ทำการค้นหาทาง </w:t>
+              <w:t xml:space="preserve"> ที่เกี่ยวข้องกับ </w:t>
             </w:r>
             <w:r>
               <w:rPr>
@@ -1656,46 +1786,7 @@
                 <w:sz w:val="32"/>
                 <w:szCs w:val="32"/>
               </w:rPr>
-              <w:t xml:space="preserve">google </w:t>
-            </w:r>
-            <w:r>
-              <w:rPr>
-                <w:rFonts w:ascii="TH SarabunPSK" w:hAnsi="TH SarabunPSK" w:cs="TH SarabunPSK" w:hint="cs"/>
-                <w:color w:val="7F7F7F" w:themeColor="text1" w:themeTint="80"/>
-                <w:sz w:val="32"/>
-                <w:szCs w:val="32"/>
-                <w:cs/>
-              </w:rPr>
-              <w:t xml:space="preserve">และได้ขอความช่วยเหลือจาก </w:t>
-            </w:r>
-            <w:r>
-              <w:rPr>
-                <w:rFonts w:ascii="TH SarabunPSK" w:hAnsi="TH SarabunPSK" w:cs="TH SarabunPSK"/>
-                <w:color w:val="7F7F7F" w:themeColor="text1" w:themeTint="80"/>
-                <w:sz w:val="32"/>
-                <w:szCs w:val="32"/>
-              </w:rPr>
-              <w:t xml:space="preserve">AI </w:t>
-            </w:r>
-            <w:r>
-              <w:rPr>
-                <w:rFonts w:ascii="TH SarabunPSK" w:hAnsi="TH SarabunPSK" w:cs="TH SarabunPSK" w:hint="cs"/>
-                <w:color w:val="7F7F7F" w:themeColor="text1" w:themeTint="80"/>
-                <w:sz w:val="32"/>
-                <w:szCs w:val="32"/>
-                <w:cs/>
-              </w:rPr>
-              <w:t>ในการแก้ปัญหา</w:t>
-            </w:r>
-            <w:r>
-              <w:rPr>
-                <w:rFonts w:ascii="TH SarabunPSK" w:hAnsi="TH SarabunPSK" w:cs="TH SarabunPSK" w:hint="cs"/>
-                <w:color w:val="7F7F7F" w:themeColor="text1" w:themeTint="80"/>
-                <w:sz w:val="32"/>
-                <w:szCs w:val="32"/>
-                <w:cs/>
-              </w:rPr>
-              <w:t xml:space="preserve"> </w:t>
+              <w:t>logic</w:t>
             </w:r>
           </w:p>
         </w:tc>
@@ -3205,8 +3296,20 @@
         <w:sz w:val="36"/>
         <w:szCs w:val="36"/>
       </w:rPr>
-      <w:t>Lab#5: Shortly Website</w:t>
+      <w:t xml:space="preserve">Lab#6: </w:t>
     </w:r>
+    <w:proofErr w:type="spellStart"/>
+    <w:r>
+      <w:rPr>
+        <w:rFonts w:ascii="TH SarabunPSK" w:hAnsi="TH SarabunPSK" w:cs="TH SarabunPSK"/>
+        <w:b/>
+        <w:bCs/>
+        <w:sz w:val="36"/>
+        <w:szCs w:val="36"/>
+      </w:rPr>
+      <w:t>LoopStudios</w:t>
+    </w:r>
+    <w:proofErr w:type="spellEnd"/>
   </w:p>
   <w:p>
     <w:pPr>
@@ -4543,21 +4646,6 @@
 </file>
 
 <file path=customXml/item1.xml><?xml version="1.0" encoding="utf-8"?>
-<p:properties xmlns:p="http://schemas.microsoft.com/office/2006/metadata/properties" xmlns:xsi="http://www.w3.org/2001/XMLSchema-instance" xmlns:pc="http://schemas.microsoft.com/office/infopath/2007/PartnerControls">
-  <documentManagement/>
-</p:properties>
-</file>
-
-<file path=customXml/item2.xml><?xml version="1.0" encoding="utf-8"?>
-<?mso-contentType ?>
-<FormTemplates xmlns="http://schemas.microsoft.com/sharepoint/v3/contenttype/forms">
-  <Display>DocumentLibraryForm</Display>
-  <Edit>DocumentLibraryForm</Edit>
-  <New>DocumentLibraryForm</New>
-</FormTemplates>
-</file>
-
-<file path=customXml/item3.xml><?xml version="1.0" encoding="utf-8"?>
 <ct:contentTypeSchema xmlns:ct="http://schemas.microsoft.com/office/2006/metadata/contentType" xmlns:ma="http://schemas.microsoft.com/office/2006/metadata/properties/metaAttributes" ct:_="" ma:_="" ma:contentTypeName="Document" ma:contentTypeID="0x0101008B15834F96E1534C9DFE4652D9BF3F0A" ma:contentTypeVersion="0" ma:contentTypeDescription="Create a new document." ma:contentTypeScope="" ma:versionID="8acd3d498b49945e870955d1a3191627">
   <xsd:schema xmlns:xsd="http://www.w3.org/2001/XMLSchema" xmlns:xs="http://www.w3.org/2001/XMLSchema" xmlns:p="http://schemas.microsoft.com/office/2006/metadata/properties" targetNamespace="http://schemas.microsoft.com/office/2006/metadata/properties" ma:root="true" ma:fieldsID="500c6692915ba10984c0aabd49f31b22">
     <xsd:element name="properties">
@@ -4671,10 +4759,32 @@
 </ct:contentTypeSchema>
 </file>
 
+<file path=customXml/item2.xml><?xml version="1.0" encoding="utf-8"?>
+<?mso-contentType ?>
+<FormTemplates xmlns="http://schemas.microsoft.com/sharepoint/v3/contenttype/forms">
+  <Display>DocumentLibraryForm</Display>
+  <Edit>DocumentLibraryForm</Edit>
+  <New>DocumentLibraryForm</New>
+</FormTemplates>
+</file>
+
+<file path=customXml/item3.xml><?xml version="1.0" encoding="utf-8"?>
+<p:properties xmlns:p="http://schemas.microsoft.com/office/2006/metadata/properties" xmlns:xsi="http://www.w3.org/2001/XMLSchema-instance" xmlns:pc="http://schemas.microsoft.com/office/infopath/2007/PartnerControls">
+  <documentManagement/>
+</p:properties>
+</file>
+
 <file path=customXml/itemProps1.xml><?xml version="1.0" encoding="utf-8"?>
-<ds:datastoreItem xmlns:ds="http://schemas.openxmlformats.org/officeDocument/2006/customXml" ds:itemID="{E10EF22D-DBB9-4252-A375-871CFAD337E1}">
+<ds:datastoreItem xmlns:ds="http://schemas.openxmlformats.org/officeDocument/2006/customXml" ds:itemID="{8C274BF9-D633-4BB5-AE0F-8092946F3A9F}">
   <ds:schemaRefs>
+    <ds:schemaRef ds:uri="http://schemas.microsoft.com/office/2006/metadata/contentType"/>
+    <ds:schemaRef ds:uri="http://schemas.microsoft.com/office/2006/metadata/properties/metaAttributes"/>
+    <ds:schemaRef ds:uri="http://www.w3.org/2001/XMLSchema"/>
     <ds:schemaRef ds:uri="http://schemas.microsoft.com/office/2006/metadata/properties"/>
+    <ds:schemaRef ds:uri="http://schemas.openxmlformats.org/package/2006/metadata/core-properties"/>
+    <ds:schemaRef ds:uri="http://purl.org/dc/elements/1.1/"/>
+    <ds:schemaRef ds:uri="http://purl.org/dc/terms/"/>
+    <ds:schemaRef ds:uri="http://schemas.microsoft.com/internal/obd"/>
     <ds:schemaRef ds:uri="http://schemas.microsoft.com/office/infopath/2007/PartnerControls"/>
   </ds:schemaRefs>
 </ds:datastoreItem>
@@ -4689,16 +4799,9 @@
 </file>
 
 <file path=customXml/itemProps3.xml><?xml version="1.0" encoding="utf-8"?>
-<ds:datastoreItem xmlns:ds="http://schemas.openxmlformats.org/officeDocument/2006/customXml" ds:itemID="{8C274BF9-D633-4BB5-AE0F-8092946F3A9F}">
+<ds:datastoreItem xmlns:ds="http://schemas.openxmlformats.org/officeDocument/2006/customXml" ds:itemID="{E10EF22D-DBB9-4252-A375-871CFAD337E1}">
   <ds:schemaRefs>
-    <ds:schemaRef ds:uri="http://schemas.microsoft.com/office/2006/metadata/contentType"/>
-    <ds:schemaRef ds:uri="http://schemas.microsoft.com/office/2006/metadata/properties/metaAttributes"/>
-    <ds:schemaRef ds:uri="http://www.w3.org/2001/XMLSchema"/>
     <ds:schemaRef ds:uri="http://schemas.microsoft.com/office/2006/metadata/properties"/>
-    <ds:schemaRef ds:uri="http://schemas.openxmlformats.org/package/2006/metadata/core-properties"/>
-    <ds:schemaRef ds:uri="http://purl.org/dc/elements/1.1/"/>
-    <ds:schemaRef ds:uri="http://purl.org/dc/terms/"/>
-    <ds:schemaRef ds:uri="http://schemas.microsoft.com/internal/obd"/>
     <ds:schemaRef ds:uri="http://schemas.microsoft.com/office/infopath/2007/PartnerControls"/>
   </ds:schemaRefs>
 </ds:datastoreItem>

</xml_diff>